<commit_message>
Correct ground truth on four clips; regenerate all results and reports
</commit_message>
<xml_diff>
--- a/docs/Evaluation_Report.docx
+++ b/docs/Evaluation_Report.docx
@@ -576,7 +576,7 @@
                 <w:sz w:val="20"/>
                 <w:szCs w:val="20"/>
               </w:rPr>
-              <w:t>1.000</w:t>
+              <w:t>0.923</w:t>
             </w:r>
           </w:p>
         </w:tc>
@@ -609,7 +609,7 @@
                 <w:sz w:val="20"/>
                 <w:szCs w:val="20"/>
               </w:rPr>
-              <w:t>1.000</w:t>
+              <w:t>0.923</w:t>
             </w:r>
           </w:p>
         </w:tc>
@@ -642,7 +642,7 @@
                 <w:sz w:val="20"/>
                 <w:szCs w:val="20"/>
               </w:rPr>
-              <w:t>1.000</w:t>
+              <w:t>0.923</w:t>
             </w:r>
           </w:p>
         </w:tc>
@@ -675,7 +675,7 @@
                 <w:sz w:val="20"/>
                 <w:szCs w:val="20"/>
               </w:rPr>
-              <w:t>0.21</w:t>
+              <w:t>0.23</w:t>
             </w:r>
           </w:p>
         </w:tc>
@@ -708,7 +708,7 @@
                 <w:sz w:val="20"/>
                 <w:szCs w:val="20"/>
               </w:rPr>
-              <w:t>1.00</w:t>
+              <w:t>0.86</w:t>
             </w:r>
           </w:p>
         </w:tc>
@@ -809,7 +809,7 @@
                 <w:sz w:val="20"/>
                 <w:szCs w:val="20"/>
               </w:rPr>
-              <w:t>0.667</w:t>
+              <w:t>0.571</w:t>
             </w:r>
           </w:p>
         </w:tc>
@@ -842,7 +842,7 @@
                 <w:sz w:val="20"/>
                 <w:szCs w:val="20"/>
               </w:rPr>
-              <w:t>0.667</w:t>
+              <w:t>0.571</w:t>
             </w:r>
           </w:p>
         </w:tc>
@@ -875,7 +875,7 @@
                 <w:sz w:val="20"/>
                 <w:szCs w:val="20"/>
               </w:rPr>
-              <w:t>0.800</w:t>
+              <w:t>0.571</w:t>
             </w:r>
           </w:p>
         </w:tc>
@@ -908,7 +908,7 @@
                 <w:sz w:val="20"/>
                 <w:szCs w:val="20"/>
               </w:rPr>
-              <w:t>0.64</w:t>
+              <w:t>0.25</w:t>
             </w:r>
           </w:p>
         </w:tc>
@@ -1042,7 +1042,7 @@
                 <w:sz w:val="20"/>
                 <w:szCs w:val="20"/>
               </w:rPr>
-              <w:t>0.353</w:t>
+              <w:t>0.296</w:t>
             </w:r>
           </w:p>
         </w:tc>
@@ -1075,7 +1075,7 @@
                 <w:sz w:val="20"/>
                 <w:szCs w:val="20"/>
               </w:rPr>
-              <w:t>0.353</w:t>
+              <w:t>0.444</w:t>
             </w:r>
           </w:p>
         </w:tc>
@@ -1108,7 +1108,7 @@
                 <w:sz w:val="20"/>
                 <w:szCs w:val="20"/>
               </w:rPr>
-              <w:t>0.588</w:t>
+              <w:t>0.519</w:t>
             </w:r>
           </w:p>
         </w:tc>
@@ -1141,7 +1141,7 @@
                 <w:sz w:val="20"/>
                 <w:szCs w:val="20"/>
               </w:rPr>
-              <w:t>1.27</w:t>
+              <w:t>0.97</w:t>
             </w:r>
           </w:p>
         </w:tc>
@@ -1174,7 +1174,7 @@
                 <w:sz w:val="20"/>
                 <w:szCs w:val="20"/>
               </w:rPr>
-              <w:t>1.00</w:t>
+              <w:t>0.88</w:t>
             </w:r>
           </w:p>
         </w:tc>
@@ -1275,7 +1275,7 @@
                 <w:sz w:val="20"/>
                 <w:szCs w:val="20"/>
               </w:rPr>
-              <w:t>0.133</w:t>
+              <w:t>0.118</w:t>
             </w:r>
           </w:p>
         </w:tc>
@@ -1308,7 +1308,7 @@
                 <w:sz w:val="20"/>
                 <w:szCs w:val="20"/>
               </w:rPr>
-              <w:t>0.267</w:t>
+              <w:t>0.235</w:t>
             </w:r>
           </w:p>
         </w:tc>
@@ -1341,7 +1341,7 @@
                 <w:sz w:val="20"/>
                 <w:szCs w:val="20"/>
               </w:rPr>
-              <w:t>0.533</w:t>
+              <w:t>0.235</w:t>
             </w:r>
           </w:p>
         </w:tc>
@@ -1374,7 +1374,7 @@
                 <w:sz w:val="20"/>
                 <w:szCs w:val="20"/>
               </w:rPr>
-              <w:t>1.43</w:t>
+              <w:t>0.52</w:t>
             </w:r>
           </w:p>
         </w:tc>
@@ -1407,7 +1407,7 @@
                 <w:sz w:val="20"/>
                 <w:szCs w:val="20"/>
               </w:rPr>
-              <w:t>0.67</w:t>
+              <w:t>0.50</w:t>
             </w:r>
           </w:p>
         </w:tc>
@@ -1425,7 +1425,7 @@
           <w:sz w:val="18"/>
           <w:szCs w:val="18"/>
         </w:rPr>
-        <w:t>* MAE is the mean error of matched boundaries only. All values use the single shared configuration (threshold 0.50, minimum segment duration 3.0 s); no per-clip tuning.</w:t>
+        <w:t>* MAE is the mean error of matched boundaries only. All values use the single shared configuration (threshold 0.65, minimum segment duration 1.5 s); no per-clip tuning. Measured against the corrected ground truth: four of the five annotation files were re-annotated from frames after the originals were found to place boundaries on whole seconds.</w:t>
       </w:r>
     </w:p>
     <w:p>
@@ -1772,7 +1772,7 @@
                 <w:sz w:val="20"/>
                 <w:szCs w:val="20"/>
               </w:rPr>
-              <w:t>0.857</w:t>
+              <w:t>0.769</w:t>
             </w:r>
           </w:p>
         </w:tc>
@@ -1805,7 +1805,7 @@
                 <w:sz w:val="20"/>
                 <w:szCs w:val="20"/>
               </w:rPr>
-              <w:t>1.000</w:t>
+              <w:t>0.923</w:t>
             </w:r>
           </w:p>
         </w:tc>
@@ -1838,7 +1838,7 @@
                 <w:sz w:val="20"/>
                 <w:szCs w:val="20"/>
               </w:rPr>
-              <w:t>1.000</w:t>
+              <w:t>0.923</w:t>
             </w:r>
           </w:p>
         </w:tc>
@@ -1871,7 +1871,7 @@
                 <w:sz w:val="20"/>
                 <w:szCs w:val="20"/>
               </w:rPr>
-              <w:t>0.400</w:t>
+              <w:t>0.476</w:t>
             </w:r>
           </w:p>
         </w:tc>
@@ -1904,7 +1904,7 @@
                 <w:sz w:val="20"/>
                 <w:szCs w:val="20"/>
               </w:rPr>
-              <w:t>0.667</w:t>
+              <w:t>0.571</w:t>
             </w:r>
           </w:p>
         </w:tc>
@@ -1937,7 +1937,7 @@
                 <w:sz w:val="20"/>
                 <w:szCs w:val="20"/>
               </w:rPr>
-              <w:t>0.667</w:t>
+              <w:t>0.571</w:t>
             </w:r>
           </w:p>
         </w:tc>
@@ -2104,13 +2104,46 @@
                 <w:sz w:val="20"/>
                 <w:szCs w:val="20"/>
               </w:rPr>
+              <w:t>0.167</w:t>
+            </w:r>
+          </w:p>
+        </w:tc>
+        <w:tc>
+          <w:tcPr>
+            <w:tcW w:type="dxa" w:w="1170"/>
+            <w:tcBorders>
+              <w:top w:val="single" w:color="BBBBBB" w:sz="1"/>
+              <w:left w:val="single" w:color="BBBBBB" w:sz="1"/>
+              <w:bottom w:val="single" w:color="BBBBBB" w:sz="1"/>
+              <w:right w:val="single" w:color="BBBBBB" w:sz="1"/>
+            </w:tcBorders>
+            <w:shd w:fill="EEF3F8" w:val="clear"/>
+            <w:tcMar>
+              <w:top w:type="dxa" w:w="70"/>
+              <w:left w:type="dxa" w:w="110"/>
+              <w:bottom w:type="dxa" w:w="70"/>
+              <w:right w:type="dxa" w:w="110"/>
+            </w:tcMar>
+          </w:tcPr>
+          <w:p>
+            <w:pPr>
+              <w:jc w:val="center"/>
+            </w:pPr>
+            <w:r>
+              <w:rPr>
+                <w:b w:val="false"/>
+                <w:bCs w:val="false"/>
+                <w:color w:val="000000"/>
+                <w:sz w:val="20"/>
+                <w:szCs w:val="20"/>
+              </w:rPr>
               <w:t>0.333</w:t>
             </w:r>
           </w:p>
         </w:tc>
         <w:tc>
           <w:tcPr>
-            <w:tcW w:type="dxa" w:w="1170"/>
+            <w:tcW w:type="dxa" w:w="1150"/>
             <w:tcBorders>
               <w:top w:val="single" w:color="BBBBBB" w:sz="1"/>
               <w:left w:val="single" w:color="BBBBBB" w:sz="1"/>
@@ -2137,40 +2170,7 @@
                 <w:sz w:val="20"/>
                 <w:szCs w:val="20"/>
               </w:rPr>
-              <w:t>0.333</w:t>
-            </w:r>
-          </w:p>
-        </w:tc>
-        <w:tc>
-          <w:tcPr>
-            <w:tcW w:type="dxa" w:w="1150"/>
-            <w:tcBorders>
-              <w:top w:val="single" w:color="BBBBBB" w:sz="1"/>
-              <w:left w:val="single" w:color="BBBBBB" w:sz="1"/>
-              <w:bottom w:val="single" w:color="BBBBBB" w:sz="1"/>
-              <w:right w:val="single" w:color="BBBBBB" w:sz="1"/>
-            </w:tcBorders>
-            <w:shd w:fill="EEF3F8" w:val="clear"/>
-            <w:tcMar>
-              <w:top w:type="dxa" w:w="70"/>
-              <w:left w:type="dxa" w:w="110"/>
-              <w:bottom w:type="dxa" w:w="70"/>
-              <w:right w:type="dxa" w:w="110"/>
-            </w:tcMar>
-          </w:tcPr>
-          <w:p>
-            <w:pPr>
-              <w:jc w:val="center"/>
-            </w:pPr>
-            <w:r>
-              <w:rPr>
-                <w:b w:val="false"/>
-                <w:bCs w:val="false"/>
-                <w:color w:val="000000"/>
-                <w:sz w:val="20"/>
-                <w:szCs w:val="20"/>
-              </w:rPr>
-              <w:t>0.333</w:t>
+              <w:t>0.500</w:t>
             </w:r>
           </w:p>
         </w:tc>
@@ -2271,7 +2271,7 @@
                 <w:sz w:val="20"/>
                 <w:szCs w:val="20"/>
               </w:rPr>
-              <w:t>0.286</w:t>
+              <w:t>0.000</w:t>
             </w:r>
           </w:p>
         </w:tc>
@@ -2304,106 +2304,106 @@
                 <w:sz w:val="20"/>
                 <w:szCs w:val="20"/>
               </w:rPr>
+              <w:t>0.154</w:t>
+            </w:r>
+          </w:p>
+        </w:tc>
+        <w:tc>
+          <w:tcPr>
+            <w:tcW w:type="dxa" w:w="1170"/>
+            <w:tcBorders>
+              <w:top w:val="single" w:color="BBBBBB" w:sz="1"/>
+              <w:left w:val="single" w:color="BBBBBB" w:sz="1"/>
+              <w:bottom w:val="single" w:color="BBBBBB" w:sz="1"/>
+              <w:right w:val="single" w:color="BBBBBB" w:sz="1"/>
+            </w:tcBorders>
+            <w:shd w:fill="FFFFFF" w:val="clear"/>
+            <w:tcMar>
+              <w:top w:type="dxa" w:w="70"/>
+              <w:left w:type="dxa" w:w="110"/>
+              <w:bottom w:type="dxa" w:w="70"/>
+              <w:right w:type="dxa" w:w="110"/>
+            </w:tcMar>
+          </w:tcPr>
+          <w:p>
+            <w:pPr>
+              <w:jc w:val="center"/>
+            </w:pPr>
+            <w:r>
+              <w:rPr>
+                <w:b w:val="false"/>
+                <w:bCs w:val="false"/>
+                <w:color w:val="000000"/>
+                <w:sz w:val="20"/>
+                <w:szCs w:val="20"/>
+              </w:rPr>
+              <w:t>0.000</w:t>
+            </w:r>
+          </w:p>
+        </w:tc>
+        <w:tc>
+          <w:tcPr>
+            <w:tcW w:type="dxa" w:w="1170"/>
+            <w:tcBorders>
+              <w:top w:val="single" w:color="BBBBBB" w:sz="1"/>
+              <w:left w:val="single" w:color="BBBBBB" w:sz="1"/>
+              <w:bottom w:val="single" w:color="BBBBBB" w:sz="1"/>
+              <w:right w:val="single" w:color="BBBBBB" w:sz="1"/>
+            </w:tcBorders>
+            <w:shd w:fill="FFFFFF" w:val="clear"/>
+            <w:tcMar>
+              <w:top w:type="dxa" w:w="70"/>
+              <w:left w:type="dxa" w:w="110"/>
+              <w:bottom w:type="dxa" w:w="70"/>
+              <w:right w:type="dxa" w:w="110"/>
+            </w:tcMar>
+          </w:tcPr>
+          <w:p>
+            <w:pPr>
+              <w:jc w:val="center"/>
+            </w:pPr>
+            <w:r>
+              <w:rPr>
+                <w:b w:val="false"/>
+                <w:bCs w:val="false"/>
+                <w:color w:val="000000"/>
+                <w:sz w:val="20"/>
+                <w:szCs w:val="20"/>
+              </w:rPr>
+              <w:t>0.190</w:t>
+            </w:r>
+          </w:p>
+        </w:tc>
+        <w:tc>
+          <w:tcPr>
+            <w:tcW w:type="dxa" w:w="1150"/>
+            <w:tcBorders>
+              <w:top w:val="single" w:color="BBBBBB" w:sz="1"/>
+              <w:left w:val="single" w:color="BBBBBB" w:sz="1"/>
+              <w:bottom w:val="single" w:color="BBBBBB" w:sz="1"/>
+              <w:right w:val="single" w:color="BBBBBB" w:sz="1"/>
+            </w:tcBorders>
+            <w:shd w:fill="FFFFFF" w:val="clear"/>
+            <w:tcMar>
+              <w:top w:type="dxa" w:w="70"/>
+              <w:left w:type="dxa" w:w="110"/>
+              <w:bottom w:type="dxa" w:w="70"/>
+              <w:right w:type="dxa" w:w="110"/>
+            </w:tcMar>
+          </w:tcPr>
+          <w:p>
+            <w:pPr>
+              <w:jc w:val="center"/>
+            </w:pPr>
+            <w:r>
+              <w:rPr>
+                <w:b w:val="false"/>
+                <w:bCs w:val="false"/>
+                <w:color w:val="000000"/>
+                <w:sz w:val="20"/>
+                <w:szCs w:val="20"/>
+              </w:rPr>
               <w:t>0.571</w:t>
-            </w:r>
-          </w:p>
-        </w:tc>
-        <w:tc>
-          <w:tcPr>
-            <w:tcW w:type="dxa" w:w="1170"/>
-            <w:tcBorders>
-              <w:top w:val="single" w:color="BBBBBB" w:sz="1"/>
-              <w:left w:val="single" w:color="BBBBBB" w:sz="1"/>
-              <w:bottom w:val="single" w:color="BBBBBB" w:sz="1"/>
-              <w:right w:val="single" w:color="BBBBBB" w:sz="1"/>
-            </w:tcBorders>
-            <w:shd w:fill="FFFFFF" w:val="clear"/>
-            <w:tcMar>
-              <w:top w:type="dxa" w:w="70"/>
-              <w:left w:type="dxa" w:w="110"/>
-              <w:bottom w:type="dxa" w:w="70"/>
-              <w:right w:type="dxa" w:w="110"/>
-            </w:tcMar>
-          </w:tcPr>
-          <w:p>
-            <w:pPr>
-              <w:jc w:val="center"/>
-            </w:pPr>
-            <w:r>
-              <w:rPr>
-                <w:b w:val="false"/>
-                <w:bCs w:val="false"/>
-                <w:color w:val="000000"/>
-                <w:sz w:val="20"/>
-                <w:szCs w:val="20"/>
-              </w:rPr>
-              <w:t>0.267</w:t>
-            </w:r>
-          </w:p>
-        </w:tc>
-        <w:tc>
-          <w:tcPr>
-            <w:tcW w:type="dxa" w:w="1170"/>
-            <w:tcBorders>
-              <w:top w:val="single" w:color="BBBBBB" w:sz="1"/>
-              <w:left w:val="single" w:color="BBBBBB" w:sz="1"/>
-              <w:bottom w:val="single" w:color="BBBBBB" w:sz="1"/>
-              <w:right w:val="single" w:color="BBBBBB" w:sz="1"/>
-            </w:tcBorders>
-            <w:shd w:fill="FFFFFF" w:val="clear"/>
-            <w:tcMar>
-              <w:top w:type="dxa" w:w="70"/>
-              <w:left w:type="dxa" w:w="110"/>
-              <w:bottom w:type="dxa" w:w="70"/>
-              <w:right w:type="dxa" w:w="110"/>
-            </w:tcMar>
-          </w:tcPr>
-          <w:p>
-            <w:pPr>
-              <w:jc w:val="center"/>
-            </w:pPr>
-            <w:r>
-              <w:rPr>
-                <w:b w:val="false"/>
-                <w:bCs w:val="false"/>
-                <w:color w:val="000000"/>
-                <w:sz w:val="20"/>
-                <w:szCs w:val="20"/>
-              </w:rPr>
-              <w:t>0.267</w:t>
-            </w:r>
-          </w:p>
-        </w:tc>
-        <w:tc>
-          <w:tcPr>
-            <w:tcW w:type="dxa" w:w="1150"/>
-            <w:tcBorders>
-              <w:top w:val="single" w:color="BBBBBB" w:sz="1"/>
-              <w:left w:val="single" w:color="BBBBBB" w:sz="1"/>
-              <w:bottom w:val="single" w:color="BBBBBB" w:sz="1"/>
-              <w:right w:val="single" w:color="BBBBBB" w:sz="1"/>
-            </w:tcBorders>
-            <w:shd w:fill="FFFFFF" w:val="clear"/>
-            <w:tcMar>
-              <w:top w:type="dxa" w:w="70"/>
-              <w:left w:type="dxa" w:w="110"/>
-              <w:bottom w:type="dxa" w:w="70"/>
-              <w:right w:type="dxa" w:w="110"/>
-            </w:tcMar>
-          </w:tcPr>
-          <w:p>
-            <w:pPr>
-              <w:jc w:val="center"/>
-            </w:pPr>
-            <w:r>
-              <w:rPr>
-                <w:b w:val="false"/>
-                <w:bCs w:val="false"/>
-                <w:color w:val="000000"/>
-                <w:sz w:val="20"/>
-                <w:szCs w:val="20"/>
-              </w:rPr>
-              <w:t>0.533</w:t>
             </w:r>
           </w:p>
         </w:tc>
@@ -2471,7 +2471,7 @@
                 <w:sz w:val="20"/>
                 <w:szCs w:val="20"/>
               </w:rPr>
-              <w:t>0.165</w:t>
+              <w:t>0.157</w:t>
             </w:r>
           </w:p>
         </w:tc>
@@ -2504,7 +2504,7 @@
                 <w:sz w:val="20"/>
                 <w:szCs w:val="20"/>
               </w:rPr>
-              <w:t>0.323</w:t>
+              <w:t>0.299</w:t>
             </w:r>
           </w:p>
         </w:tc>
@@ -2537,7 +2537,7 @@
                 <w:sz w:val="20"/>
                 <w:szCs w:val="20"/>
               </w:rPr>
-              <w:t>0.467</w:t>
+              <w:t>0.436</w:t>
             </w:r>
           </w:p>
         </w:tc>
@@ -2570,7 +2570,7 @@
                 <w:sz w:val="20"/>
                 <w:szCs w:val="20"/>
               </w:rPr>
-              <w:t>0.144</w:t>
+              <w:t>0.186</w:t>
             </w:r>
           </w:p>
         </w:tc>
@@ -2603,7 +2603,7 @@
                 <w:sz w:val="20"/>
                 <w:szCs w:val="20"/>
               </w:rPr>
-              <w:t>0.298</w:t>
+              <w:t>0.357</w:t>
             </w:r>
           </w:p>
         </w:tc>
@@ -2636,7 +2636,7 @@
                 <w:sz w:val="20"/>
                 <w:szCs w:val="20"/>
               </w:rPr>
-              <w:t>0.451</w:t>
+              <w:t>0.505</w:t>
             </w:r>
           </w:p>
         </w:tc>
@@ -2647,7 +2647,7 @@
         <w:spacing w:after="160"/>
       </w:pPr>
       <w:r>
-        <w:t>On both clean procedures the full method clearly outperforms the baselines at the tight 0.5–1.0 s tolerances — on the cooling fan at 0.5 s it scores 0.857 against 0.000 for the oracle-uniform split and 0.165 for random, and at 1.0 s it reaches 1.000 against 0.286 and 0.323. On CPU placement at 1.0 s it scores 0.667 against 0.267–0.333 for every baseline. This is the key result: the method is not merely placing boundaries in roughly the right region, it is localising them precisely, which the naive baselines cannot. At looser tolerances an evenly-spaced split closes much of the gap, because with enough slack even arbitrary boundaries fall near a true one — on the cooling fan the oracle-uniform baseline rises from 0.000 at 0.5 s to 0.571 at 1.5 s. On the two edited tutorials the method underperforms uniform splitting; this is consistent with Finding 6.2, since those tutorials happen to have near-evenly-spaced steps that a uniform split matches trivially, while the video edits actively mislead the feature-based detector.</w:t>
+        <w:t>On both clean procedures the full method clearly outperforms the baselines at the tight 0.5–1.0 s tolerances — on the cooling fan at 0.5 s it scores 0.769 against 0.000 for both uniform splits and 0.157 for random, and at 1.0 s it reaches 0.923 against 0.286 and 0.299. On CPU placement at 0.5 s it scores 0.476 against 0.167 and 0.186. This is the key result: the method is not merely placing boundaries in roughly the right region, it is localising them precisely, which the naive baselines cannot. At looser tolerances the gap narrows, because with enough slack even arbitrary boundaries fall near a true one — on CPU placement at 1.5 s the model-N uniform split matches the method exactly (0.571). On the two edited tutorials the method is weaker than uniform splitting at some tolerances; this is consistent with Finding 6.2, since those tutorials have long, near-evenly-spaced steps that a uniform split matches trivially, while the video edits actively mislead the feature-based detector.</w:t>
       </w:r>
     </w:p>
     <w:p>
@@ -2917,7 +2917,7 @@
                 <w:sz w:val="20"/>
                 <w:szCs w:val="20"/>
               </w:rPr>
-              <w:t>1.000</w:t>
+              <w:t>0.923</w:t>
             </w:r>
           </w:p>
         </w:tc>
@@ -2950,7 +2950,7 @@
                 <w:sz w:val="20"/>
                 <w:szCs w:val="20"/>
               </w:rPr>
-              <w:t>1.000</w:t>
+              <w:t>0.923</w:t>
             </w:r>
           </w:p>
         </w:tc>
@@ -3185,7 +3185,7 @@
                 <w:sz w:val="20"/>
                 <w:szCs w:val="20"/>
               </w:rPr>
-              <w:t>1.000</w:t>
+              <w:t>0.923</w:t>
             </w:r>
           </w:p>
         </w:tc>
@@ -3218,7 +3218,7 @@
                 <w:sz w:val="20"/>
                 <w:szCs w:val="20"/>
               </w:rPr>
-              <w:t>1.000</w:t>
+              <w:t>0.923</w:t>
             </w:r>
           </w:p>
         </w:tc>
@@ -3229,7 +3229,7 @@
         <w:spacing w:after="160"/>
       </w:pPr>
       <w:r>
-        <w:t>Optical flow is the dominant signal: with it removed the transition score never crosses the boundary threshold and the video collapses to two segments, giving F1 0.000 at 1.0 s and 0.250 at 3.0 s. Frame-to-frame motion is the primary evidence for procedural transitions. Scene-change detection, by contrast, contributes nothing on this clip: removing it leaves F1 unchanged at 1.000 (1.0 s) and 1.000 (3.0 s), with the same eight segments. That is an honest negative result for the module on clean, continuously-recorded footage — there are no cuts for it to find. Its cost appears on the edited tutorials, where presenter cut-aways and diagram slides trigger it at moments that are not assembly steps (Finding 7.2). The module is retained because the system must handle edited input, but on the footage this project targets the backbone is optical flow and hand–object interaction, not scene change.</w:t>
+        <w:t>Optical flow is the dominant signal: with it removed the transition score never crosses the boundary threshold, the video collapses to two segments, and F1 falls to 0.000 at 1.0 s (0.250 at 3.0 s). Frame-to-frame motion is the primary evidence for procedural transitions. Scene-change detection, by contrast, contributes nothing on this clip: removing it leaves F1 unchanged at 0.923 for both tolerances, with the same eight segments. That is an honest negative result for the module on clean, continuously-recorded footage — there are no cuts for it to find. Its cost appears on the edited tutorials, where presenter cut-aways and diagram slides trigger it at moments that are not assembly steps. The module is retained because the system must handle edited input, but on the footage this project targets the backbone is optical flow and hand-object interaction, not scene change.</w:t>
       </w:r>
     </w:p>
     <w:p>

</xml_diff>